<commit_message>
Add teacher tiers and dual-handle year range picker for collections exams.
Teachers tag collection questions as gold/silver/bronze; students filter by tier and select a year range via the green timeline in collections and the personal simulator.

Co-authored-by: Cursor <cursoragent@cursor.com>
</commit_message>
<xml_diff>
--- a/frontend/public/samples/questions-template.docx
+++ b/frontend/public/samples/questions-template.docx
@@ -45,7 +45,7 @@
         <w:rPr>
           <w:rtl/>
         </w:rPr>
-        <w:t xml:space="preserve">السطور «السنة / الصعوبة / الشرح / فيديو» اختيارية. لو نقص شيء يستورد السؤال بعلامة «بحاجة لمراجعة».</w:t>
+        <w:t xml:space="preserve">السطور «السنة / الصعوبة / الترشيح / الشرح / فيديو» اختيارية. لو نقص شيء يستورد السؤال بعلامة «بحاجة لمراجعة».</w:t>
       </w:r>
     </w:p>
     <w:p>
@@ -156,6 +156,17 @@
           <w:rtl/>
         </w:rPr>
         <w:t xml:space="preserve">الصعوبة: سهل</w:t>
+      </w:r>
+    </w:p>
+    <w:p>
+      <w:pPr>
+        <w:bidi/>
+      </w:pPr>
+      <w:r>
+        <w:rPr>
+          <w:rtl/>
+        </w:rPr>
+        <w:t xml:space="preserve">الترشيح: ذهبي</w:t>
       </w:r>
     </w:p>
     <w:p>

</xml_diff>